<commit_message>
update: docx escopo corrigido DETRANs brasileiros
</commit_message>
<xml_diff>
--- a/Analise_Sentimento_DETRANs_Brasil.docx
+++ b/Analise_Sentimento_DETRANs_Brasil.docx
@@ -33,7 +33,7 @@
           <w:sz w:val="28"/>
           <w:szCs w:val="28"/>
         </w:rPr>
-        <w:t xml:space="preserve">MANIFESTAÇÕES DO DETRAN-DF</w:t>
+        <w:t xml:space="preserve">MANIFESTAÇÕES DOS DETRANS BRASILEIROS</w:t>
       </w:r>
     </w:p>
     <w:p>
@@ -148,7 +148,7 @@
           <w:sz w:val="22"/>
           <w:szCs w:val="22"/>
         </w:rPr>
-        <w:t xml:space="preserve">O Departamento de Trânsito do Distrito Federal (Detran-DF) é o órgão responsável por habilitar condutores, registrar e licenciar veículos, aplicar e julgar infrações de trânsito e promover a educação viária no Distrito Federal. Por tratar diretamente com a população em serviços de alto impacto — como obtenção da Carteira Nacional de Habilitação (CNH), emplacamento de veículos e recurso de multas —, o Detran-DF é frequentemente alvo de manifestações no sistema de ouvidoria do governo federal.</w:t>
+        <w:t xml:space="preserve">Os Departamentos de Trânsito (DETRANs) de oito estados brasileiros são responsáveis por habilitar condutores, registrar e licenciar veículos, aplicar e julgar infrações de trânsito e promover a educação viária em seus estados. Por tratarem diretamente com a população em serviços de alto impacto — como obtenção da Carteira Nacional de Habilitação (CNH), emplacamento de veículos e recurso de multas —, os DETRANs são frequentemente alvo de manifestações no sistema de ouvidoria do governo federal.</w:t>
       </w:r>
     </w:p>
     <w:p>
@@ -208,7 +208,7 @@
           <w:sz w:val="22"/>
           <w:szCs w:val="22"/>
         </w:rPr>
-        <w:t xml:space="preserve">Quais são os principais motivos de insatisfação dos cidadãos com o Detran-DF, e como o sentimento expresso nas manifestações varia por tipo de serviço e ao longo do tempo?</w:t>
+        <w:t xml:space="preserve">Quais são os principais motivos de insatisfação dos cidadãos com os DETRANs brasileiros, e como o sentimento expresso nas manifestações varia por tipo de serviço e ao longo do tempo?</w:t>
       </w:r>
     </w:p>
     <w:p>
@@ -244,7 +244,7 @@
           <w:sz w:val="22"/>
           <w:szCs w:val="22"/>
         </w:rPr>
-        <w:t xml:space="preserve">A análise automática de manifestações de ouvidoria permite ao gestor público identificar gargalos operacionais em tempo real, sem depender de relatórios manuais. Com PLN, é possível processar centenas de textos em minutos, classificar automaticamente os problemas por tipo e monitorar a evolução do sentimento ao longo do tempo. Este projeto demonstra como técnicas de Deep Learning (Transformers) podem gerar valor prático na administração pública do Distrito Federal.</w:t>
+        <w:t xml:space="preserve">A análise automática de manifestações de ouvidoria permite ao gestor público identificar gargalos operacionais em tempo real, sem depender de relatórios manuais. Com PLN, é possível processar centenas de textos em minutos, classificar automaticamente os problemas por tipo e monitorar a evolução do sentimento ao longo do tempo. Este projeto demonstra como técnicas de Deep Learning (Transformers) podem gerar valor prático na administração pública dos estados analisados.</w:t>
       </w:r>
     </w:p>
     <w:p>
@@ -674,7 +674,7 @@
                 <w:sz w:val="20"/>
                 <w:szCs w:val="20"/>
               </w:rPr>
-              <w:t xml:space="preserve">Detran-DF (código SIORG: 57877)</w:t>
+              <w:t xml:space="preserve">DETRANs de RN, TO, RJ, MS, PI, AM, RR e RO</w:t>
             </w:r>
           </w:p>
         </w:tc>
@@ -4206,7 +4206,7 @@
           <w:sz w:val="22"/>
           <w:szCs w:val="22"/>
         </w:rPr>
-        <w:t xml:space="preserve">Os resultados permitem responder diretamente à pergunta de pesquisa: [preencher após obter resultados]. A predominância de manifestações negativas era esperada em dados de ouvidoria, dado que usuários satisfeitos raramente registram manifestações formais. Isso representa uma limitação inerente ao corpus: os dados refletem o perfil de quem busca o canal de ouvidoria, não necessariamente a experiência média do usuário do Detran-DF.</w:t>
+        <w:t xml:space="preserve">Os resultados permitem responder diretamente à pergunta de pesquisa: [preencher após obter resultados]. A predominância de manifestações negativas era esperada em dados de ouvidoria, dado que usuários satisfeitos raramente registram manifestações formais. Isso representa uma limitação inerente ao corpus: os dados refletem o perfil de quem busca o canal de ouvidoria, não necessariamente a experiência média dos usuários dos DETRANs.</w:t>
       </w:r>
     </w:p>
     <w:p>
@@ -4225,7 +4225,7 @@
           <w:sz w:val="22"/>
           <w:szCs w:val="22"/>
         </w:rPr>
-        <w:t xml:space="preserve">A categoria de problema mais frequente em manifestações negativas (habilitação ou atendimento, provavelmente) sugere que o Detran-DF deveria priorizar melhorias nesse serviço específico. Cruzando os resultados com informações públicas sobre o número de atendimentos por serviço, seria possível calcular uma 'taxa de insatisfação normalizada' por tipo de serviço — o que constitui um próximo passo relevante deste projeto.</w:t>
+        <w:t xml:space="preserve">A categoria de problema mais frequente em manifestações negativas (habilitação ou atendimento, provavelmente) sugere que os DETRANs deveriam priorizar melhorias nesse serviço específico. Cruzando os resultados com informações públicas sobre o número de atendimentos por serviço, seria possível calcular uma 'taxa de insatisfação normalizada' por tipo de serviço — o que constitui um próximo passo relevante deste projeto.</w:t>
       </w:r>
     </w:p>
     <w:p>
@@ -4373,7 +4373,7 @@
           <w:sz w:val="22"/>
           <w:szCs w:val="22"/>
         </w:rPr>
-        <w:t xml:space="preserve">Um sistema desse tipo, implantado em tempo real no Detran-DF, permitiria ao setor de ouvidoria priorizar automaticamente manifestações com sentimento negativo e alta gravidade, redirecionar textos classificados para as equipes responsáveis por cada serviço e monitorar picos de insatisfação em períodos críticos (ex: após mudanças no sistema digital ou aumento de demanda por CNH).</w:t>
+        <w:t xml:space="preserve">Um sistema desse tipo, implantado em tempo real nos DETRANs, permitiria ao setor de ouvidoria priorizar automaticamente manifestações com sentimento negativo e alta gravidade, redirecionar textos classificados para as equipes responsáveis por cada serviço e monitorar picos de insatisfação em períodos críticos (ex: após mudanças no sistema digital ou aumento de demanda por CNH).</w:t>
       </w:r>
     </w:p>
     <w:p>
@@ -4409,7 +4409,7 @@
           <w:sz w:val="22"/>
           <w:szCs w:val="22"/>
         </w:rPr>
-        <w:t xml:space="preserve">Este trabalho demonstrou a viabilidade de aplicar técnicas de PLN — especificamente Transformers para análise de sentimento e TF-IDF + SVM para classificação textual — a dados inéditos de ouvidoria do Detran-DF, coletados diretamente via API pública do portal Fala.BR. Os resultados evidenciam [preencher após obter dados reais].</w:t>
+        <w:t xml:space="preserve">Este trabalho demonstrou a viabilidade de aplicar técnicas de PLN — especificamente Transformers para análise de sentimento e TF-IDF + SVM para classificação textual — a dados reais de ouvidoria de DETRANs de 8 estados brasileiros, coletados via dados abertos da CGU. Os resultados evidenciam [preencher após obter dados reais].</w:t>
       </w:r>
     </w:p>
     <w:p>

</xml_diff>